<commit_message>
Morning Entry handout: add "use the restroom before entering the classroom"
Insert a restroom step into the student handout's "What I do" sequence,
placed before crossing the classroom threshold (now step 3 of 7), and
move the 6–8 top-of-stairs restroom detail into that step. Same style
and numbering as the rest of the handout set.

Co-Authored-By: Claude Opus 4.8 <noreply@anthropic.com>
Claude-Session: https://claude.ai/code/session_01EQ6CeDoz4zcPWJ9SSU5TAi
</commit_message>
<xml_diff>
--- a/resources/procedures/schoolwide/handouts/morning-entry-student-handout.docx
+++ b/resources/procedures/schoolwide/handouts/morning-entry-student-handout.docx
@@ -154,7 +154,7 @@
           <w:sz w:val="21"/>
           <w:szCs w:val="21"/>
         </w:rPr>
-        <w:t xml:space="preserve">K–5: turn right at the Media Center to my homeroom. 6–8: up the first stairwell (restroom at the top; 8th grade, locker first).</w:t>
+        <w:t xml:space="preserve">K–5: turn right at the Media Center to my homeroom. 6–8: up the first stairwell (8th grade, locker first).</w:t>
       </w:r>
     </w:p>
     <w:p>
@@ -182,16 +182,16 @@
           <w:sz w:val="21"/>
           <w:szCs w:val="21"/>
         </w:rPr>
-        <w:t xml:space="preserve">Cross the threshold silently. </w:t>
-      </w:r>
-      <w:r>
-        <w:rPr>
-          <w:rFonts w:ascii="Calibri" w:cs="Calibri" w:eastAsia="Calibri" w:hAnsi="Calibri"/>
-          <w:color w:val="1a1a1a"/>
-          <w:sz w:val="21"/>
-          <w:szCs w:val="21"/>
-        </w:rPr>
-        <w:t xml:space="preserve">At my classroom door — no talking yet.</w:t>
+        <w:t xml:space="preserve">Use the restroom. </w:t>
+      </w:r>
+      <w:r>
+        <w:rPr>
+          <w:rFonts w:ascii="Calibri" w:cs="Calibri" w:eastAsia="Calibri" w:hAnsi="Calibri"/>
+          <w:color w:val="1a1a1a"/>
+          <w:sz w:val="21"/>
+          <w:szCs w:val="21"/>
+        </w:rPr>
+        <w:t xml:space="preserve">I go to the restroom before I enter my classroom, so I'm ready to learn and don't have to leave once we start. (6–8: at the top of the stairs.)</w:t>
       </w:r>
     </w:p>
     <w:p>
@@ -219,16 +219,16 @@
           <w:sz w:val="21"/>
           <w:szCs w:val="21"/>
         </w:rPr>
-        <w:t xml:space="preserve">Store. </w:t>
-      </w:r>
-      <w:r>
-        <w:rPr>
-          <w:rFonts w:ascii="Calibri" w:cs="Calibri" w:eastAsia="Calibri" w:hAnsi="Calibri"/>
-          <w:color w:val="1a1a1a"/>
-          <w:sz w:val="21"/>
-          <w:szCs w:val="21"/>
-        </w:rPr>
-        <w:t xml:space="preserve">Backpack away. Coat put away, never on my chair. Phone away and off my body. Lunch in the tote.</w:t>
+        <w:t xml:space="preserve">Cross the threshold silently. </w:t>
+      </w:r>
+      <w:r>
+        <w:rPr>
+          <w:rFonts w:ascii="Calibri" w:cs="Calibri" w:eastAsia="Calibri" w:hAnsi="Calibri"/>
+          <w:color w:val="1a1a1a"/>
+          <w:sz w:val="21"/>
+          <w:szCs w:val="21"/>
+        </w:rPr>
+        <w:t xml:space="preserve">At my classroom door — no talking yet.</w:t>
       </w:r>
     </w:p>
     <w:p>
@@ -256,16 +256,16 @@
           <w:sz w:val="21"/>
           <w:szCs w:val="21"/>
         </w:rPr>
-        <w:t xml:space="preserve">Sit. </w:t>
-      </w:r>
-      <w:r>
-        <w:rPr>
-          <w:rFonts w:ascii="Calibri" w:cs="Calibri" w:eastAsia="Calibri" w:hAnsi="Calibri"/>
-          <w:color w:val="1a1a1a"/>
-          <w:sz w:val="21"/>
-          <w:szCs w:val="21"/>
-        </w:rPr>
-        <w:t xml:space="preserve">Assigned seat, right away. Desk clear — only what I need is out.</w:t>
+        <w:t xml:space="preserve">Store. </w:t>
+      </w:r>
+      <w:r>
+        <w:rPr>
+          <w:rFonts w:ascii="Calibri" w:cs="Calibri" w:eastAsia="Calibri" w:hAnsi="Calibri"/>
+          <w:color w:val="1a1a1a"/>
+          <w:sz w:val="21"/>
+          <w:szCs w:val="21"/>
+        </w:rPr>
+        <w:t xml:space="preserve">Backpack away. Coat put away, never on my chair. Phone away and off my body. Lunch in the tote.</w:t>
       </w:r>
     </w:p>
     <w:p>
@@ -283,6 +283,43 @@
           <w:szCs w:val="21"/>
         </w:rPr>
         <w:t xml:space="preserve">6.  </w:t>
+      </w:r>
+      <w:r>
+        <w:rPr>
+          <w:rFonts w:ascii="Calibri" w:cs="Calibri" w:eastAsia="Calibri" w:hAnsi="Calibri"/>
+          <w:b/>
+          <w:bCs/>
+          <w:color w:val="1a1a1a"/>
+          <w:sz w:val="21"/>
+          <w:szCs w:val="21"/>
+        </w:rPr>
+        <w:t xml:space="preserve">Sit. </w:t>
+      </w:r>
+      <w:r>
+        <w:rPr>
+          <w:rFonts w:ascii="Calibri" w:cs="Calibri" w:eastAsia="Calibri" w:hAnsi="Calibri"/>
+          <w:color w:val="1a1a1a"/>
+          <w:sz w:val="21"/>
+          <w:szCs w:val="21"/>
+        </w:rPr>
+        <w:t xml:space="preserve">Assigned seat, right away. Desk clear — only what I need is out.</w:t>
+      </w:r>
+    </w:p>
+    <w:p>
+      <w:pPr>
+        <w:spacing w:before="0" w:after="80"/>
+        <w:ind w:left="360"/>
+      </w:pPr>
+      <w:r>
+        <w:rPr>
+          <w:rFonts w:ascii="Calibri" w:cs="Calibri" w:eastAsia="Calibri" w:hAnsi="Calibri"/>
+          <w:b/>
+          <w:bCs/>
+          <w:color w:val="b3312c"/>
+          <w:sz w:val="21"/>
+          <w:szCs w:val="21"/>
+        </w:rPr>
+        <w:t xml:space="preserve">7.  </w:t>
       </w:r>
       <w:r>
         <w:rPr>

</xml_diff>